<commit_message>
Cambió de tamaño de letra y corrección de errores
Se cambia el apartado de cambio de fuente de letra de CSS a JavaScript.
Se corrigen errores técnicos en las secciones de header, comunicados y formulario. También se dividió el script de estas últimas dos secciones a dos archivos distintos.
</commit_message>
<xml_diff>
--- a/EVA2_Funcionalidades requeridas.docx
+++ b/EVA2_Funcionalidades requeridas.docx
@@ -45,6 +45,13 @@
       <w:r>
         <w:t xml:space="preserve">Carga dinámica de contenido </w:t>
       </w:r>
+      <w:r>
+        <w:rPr>
+          <w:b/>
+          <w:bCs/>
+        </w:rPr>
+        <w:t>(Hecho)</w:t>
+      </w:r>
     </w:p>
     <w:p>
       <w:pPr>
@@ -57,6 +64,13 @@
       <w:r>
         <w:t xml:space="preserve">Filtro o búsqueda interactiva </w:t>
       </w:r>
+      <w:r>
+        <w:rPr>
+          <w:b/>
+          <w:bCs/>
+        </w:rPr>
+        <w:t>(Hecho)</w:t>
+      </w:r>
     </w:p>
     <w:p>
       <w:pPr>
@@ -74,7 +88,7 @@
           <w:b/>
           <w:bCs/>
         </w:rPr>
-        <w:t>(Hecho a la mitad)</w:t>
+        <w:t>(Hecho)</w:t>
       </w:r>
     </w:p>
     <w:p>
@@ -87,6 +101,16 @@
       </w:pPr>
       <w:r>
         <w:t>Carrito o lista de favoritos (funcionalidad contextual)</w:t>
+      </w:r>
+      <w:r>
+        <w:t xml:space="preserve"> </w:t>
+      </w:r>
+      <w:r>
+        <w:rPr>
+          <w:b/>
+          <w:bCs/>
+        </w:rPr>
+        <w:t>(Hecho)</w:t>
       </w:r>
     </w:p>
     <w:p>

</xml_diff>